<commit_message>
Adiciona link do vídeo no relatório
</commit_message>
<xml_diff>
--- a/Relatorio/GS-Gov.IA.docx
+++ b/Relatorio/GS-Gov.IA.docx
@@ -4710,7 +4710,7 @@
         </w:rPr>
       </w:r>
     </w:p>
-    <w:p xmlns:wp14="http://schemas.microsoft.com/office/word/2010/wordml" wp14:textId="77777777">
+    <w:p xmlns:wp14="http://schemas.microsoft.com/office/word/2010/wordml" wp14:textId="2F449D43">
       <w:pPr>
         <w:spacing w:before="0" w:after="0" w:line="360" w:lineRule="auto"/>
         <w:jc w:val="left"/>
@@ -4718,103 +4718,85 @@
       <w:r>
         <w:rPr>
           <w:rFonts w:ascii="Times New Roman" w:hAnsi="Times New Roman" w:eastAsia="Times New Roman" w:cs="Times New Roman"/>
-          <w:b/>
-          <w:bCs/>
-          <w:sz w:val="24"/>
-          <w:szCs w:val="24"/>
-        </w:rPr>
-        <w:t xml:space="preserve">Repositório GitHub</w:t>
-      </w:r>
-    </w:p>
-    <w:p xmlns:wp14="http://schemas.microsoft.com/office/word/2010/wordml" wp14:textId="77777777">
-      <w:pPr>
-        <w:spacing w:line="360" w:lineRule="auto"/>
-      </w:pPr>
-      <w:r>
-        <w:rPr>
-          <w:rFonts w:ascii="Times New Roman" w:hAnsi="Times New Roman" w:eastAsia="Times New Roman" w:cs="Times New Roman"/>
-          <w:sz w:val="24"/>
-          <w:szCs w:val="24"/>
-        </w:rPr>
-      </w:r>
-    </w:p>
-    <w:p xmlns:wp14="http://schemas.microsoft.com/office/word/2010/wordml" wp14:textId="77777777">
-      <w:pPr>
-        <w:spacing w:before="0" w:after="0" w:line="360" w:lineRule="auto"/>
-        <w:jc w:val="both"/>
-      </w:pPr>
-      <w:r>
-        <w:rPr>
-          <w:rFonts w:ascii="Times New Roman" w:hAnsi="Times New Roman" w:eastAsia="Times New Roman" w:cs="Times New Roman"/>
-          <w:b w:val="false"/>
-          <w:bCs w:val="false"/>
-          <w:i w:val="false"/>
-          <w:iCs w:val="false"/>
-          <w:sz w:val="24"/>
-          <w:szCs w:val="24"/>
-        </w:rPr>
-        <w:t xml:space="preserve">Inserir o link do repositório do grupo.</w:t>
-      </w:r>
-    </w:p>
-    <w:p xmlns:wp14="http://schemas.microsoft.com/office/word/2010/wordml" wp14:textId="77777777">
-      <w:pPr>
-        <w:spacing w:line="360" w:lineRule="auto"/>
-      </w:pPr>
-      <w:r>
-        <w:rPr>
-          <w:rFonts w:ascii="Times New Roman" w:hAnsi="Times New Roman" w:eastAsia="Times New Roman" w:cs="Times New Roman"/>
-          <w:sz w:val="24"/>
-          <w:szCs w:val="24"/>
-        </w:rPr>
-      </w:r>
-    </w:p>
-    <w:p xmlns:wp14="http://schemas.microsoft.com/office/word/2010/wordml" wp14:textId="77777777">
+          <w:b w:val="1"/>
+          <w:bCs w:val="1"/>
+          <w:sz w:val="24"/>
+          <w:szCs w:val="24"/>
+          <w:lang w:val="en-US"/>
+        </w:rPr>
+        <w:t>Repositório</w:t>
+      </w:r>
+      <w:r>
+        <w:rPr>
+          <w:rFonts w:ascii="Times New Roman" w:hAnsi="Times New Roman" w:eastAsia="Times New Roman" w:cs="Times New Roman"/>
+          <w:b w:val="1"/>
+          <w:bCs w:val="1"/>
+          <w:sz w:val="24"/>
+          <w:szCs w:val="24"/>
+          <w:lang w:val="en-US"/>
+        </w:rPr>
+        <w:t xml:space="preserve"> GitHub</w:t>
+      </w:r>
+    </w:p>
+    <w:p>
       <w:pPr>
         <w:spacing w:before="0" w:after="0" w:line="360" w:lineRule="auto"/>
         <w:jc w:val="left"/>
-      </w:pPr>
-      <w:r>
-        <w:rPr>
-          <w:rFonts w:ascii="Times New Roman" w:hAnsi="Times New Roman" w:eastAsia="Times New Roman" w:cs="Times New Roman"/>
-          <w:b/>
-          <w:bCs/>
-          <w:sz w:val="24"/>
-          <w:szCs w:val="24"/>
-        </w:rPr>
-        <w:t xml:space="preserve">Vídeo de Apresentação</w:t>
-      </w:r>
-    </w:p>
-    <w:p xmlns:wp14="http://schemas.microsoft.com/office/word/2010/wordml" wp14:textId="77777777">
-      <w:pPr>
-        <w:spacing w:line="360" w:lineRule="auto"/>
-      </w:pPr>
-      <w:r>
-        <w:rPr>
-          <w:rFonts w:ascii="Times New Roman" w:hAnsi="Times New Roman" w:eastAsia="Times New Roman" w:cs="Times New Roman"/>
-          <w:sz w:val="24"/>
-          <w:szCs w:val="24"/>
-        </w:rPr>
-      </w:r>
-    </w:p>
-    <w:p xmlns:wp14="http://schemas.microsoft.com/office/word/2010/wordml" wp14:textId="77777777">
-      <w:pPr>
-        <w:spacing w:before="0" w:after="0" w:line="360" w:lineRule="auto"/>
-        <w:jc w:val="both"/>
-      </w:pPr>
-      <w:r>
-        <w:rPr>
-          <w:rFonts w:ascii="Times New Roman" w:hAnsi="Times New Roman" w:eastAsia="Times New Roman" w:cs="Times New Roman"/>
-          <w:b w:val="false"/>
-          <w:bCs w:val="false"/>
-          <w:i w:val="false"/>
-          <w:iCs w:val="false"/>
-          <w:sz w:val="24"/>
-          <w:szCs w:val="24"/>
-        </w:rPr>
-        <w:t xml:space="preserve">Inserir o link do vídeo publicado no YouTube em modo não listado.</w:t>
-      </w:r>
-    </w:p>
-    <w:p xmlns:wp14="http://schemas.microsoft.com/office/word/2010/wordml" wp14:textId="77777777">
+        <w:rPr>
+          <w:rFonts w:ascii="Times New Roman" w:hAnsi="Times New Roman" w:eastAsia="Times New Roman" w:cs="Times New Roman"/>
+          <w:b w:val="1"/>
+          <w:bCs w:val="1"/>
+          <w:sz w:val="24"/>
+          <w:szCs w:val="24"/>
+          <w:lang w:val="en-US"/>
+        </w:rPr>
+      </w:pPr>
+    </w:p>
+    <w:p xmlns:wp14="http://schemas.microsoft.com/office/word/2010/wordml" wp14:textId="0CCB1A27">
+      <w:pPr>
+        <w:spacing w:line="360" w:lineRule="auto"/>
+      </w:pPr>
+      <w:hyperlink r:id="Rf580b5f3b2304fcb">
+        <w:r>
+          <w:rPr>
+            <w:rStyle w:val="Hyperlink"/>
+          </w:rPr>
+          <w:t>https://github.com/diogo-cedola/GS2026</w:t>
+        </w:r>
+      </w:hyperlink>
+    </w:p>
+    <w:p>
+      <w:pPr>
+        <w:spacing w:line="360" w:lineRule="auto"/>
+      </w:pPr>
+    </w:p>
+    <w:p xmlns:wp14="http://schemas.microsoft.com/office/word/2010/wordml" wp14:textId="77777777">
+      <w:pPr>
+        <w:spacing w:before="0" w:after="0" w:line="360" w:lineRule="auto"/>
+        <w:jc w:val="left"/>
+      </w:pPr>
+      <w:r>
+        <w:rPr>
+          <w:rFonts w:ascii="Times New Roman" w:hAnsi="Times New Roman" w:eastAsia="Times New Roman" w:cs="Times New Roman"/>
+          <w:b w:val="1"/>
+          <w:bCs w:val="1"/>
+          <w:sz w:val="24"/>
+          <w:szCs w:val="24"/>
+          <w:lang w:val="en-US"/>
+        </w:rPr>
+        <w:t>Vídeo de Apresentação</w:t>
+      </w:r>
+    </w:p>
+    <w:p xmlns:wp14="http://schemas.microsoft.com/office/word/2010/wordml" wp14:textId="77777777">
+      <w:pPr>
+        <w:spacing w:line="360" w:lineRule="auto"/>
+      </w:pPr>
+    </w:p>
+    <w:p xmlns:wp14="http://schemas.microsoft.com/office/word/2010/wordml" wp14:textId="4DCEA158">
+      <w:r>
+        <w:rPr/>
+        <w:t>https://youtu.be/J8SD_jja4ZM</w:t>
+      </w:r>
       <w:r>
         <w:br w:type="page"/>
       </w:r>

</xml_diff>